<commit_message>
Resume: Senior Risk Analyst @ Mott MacDonald (MNC)
</commit_message>
<xml_diff>
--- a/resumes/Resume_Senior_Risk_Analyst_Mott_MacDonald__MNC_.docx
+++ b/resumes/Resume_Senior_Risk_Analyst_Mott_MacDonald__MNC_.docx
@@ -412,7 +412,7 @@
           <w:sz w:val="19"/>
           <w:szCs w:val="19"/>
         </w:rPr>
-        <w:t>Triaged 50+ weekly inventory reimbursement cases by severity and policy eligibility, mirroring the structured alert triage and escalation workflow used in risk management and compliance roles.</w:t>
+        <w:t>Triaged 50+ weekly inventory reimbursement cases by severity and policy eligibility, mirroring the structured alert triage and escalation workflow used in risk and compliance operations.</w:t>
       </w:r>
       <w:proofErr w:type="spellStart"/>
       <w:r>
@@ -449,7 +449,7 @@
           <w:sz w:val="19"/>
           <w:szCs w:val="19"/>
         </w:rPr>
-        <w:t>Performed root cause analysis on seller claims to identify policy violations and anomalous patterns; escalated findings to senior reviewers, demonstrating investigative instincts central to risk analysis and operational risk operations.</w:t>
+        <w:t>Performed root cause analysis on seller claims to identify policy violations and anomalous patterns; escalated findings to senior reviewers, demonstrating investigative instincts central to risk and fraud analysis.</w:t>
       </w:r>
     </w:p>
     <w:p>
@@ -468,7 +468,7 @@
           <w:sz w:val="19"/>
           <w:szCs w:val="19"/>
         </w:rPr>
-        <w:t>Maintained audit-ready case documentation recording investigation findings, decisions, and corrective actions, establishing the evidence chain-of-custody discipline required for security incident reporting and IT audit, ensuring regulatory compliance.</w:t>
+        <w:t>Maintained audit-ready case documentation recording investigation findings, decisions, and corrective actions, establishing the evidence chain-of-custody discipline required for security incident reporting and regulatory compliance.</w:t>
       </w:r>
     </w:p>
     <w:p>
@@ -562,7 +562,7 @@
           <w:sz w:val="19"/>
           <w:szCs w:val="19"/>
         </w:rPr>
-        <w:t>Built multi-API threat intelligence pipeline: submits suspicious URLs/IPs to VirusTotal, AbuseIPDB, and URLScan.io simultaneously; cross-references WHOIS registration age, DNS records, and SSL details to produce a unified phishing probability score, leveraging OSINT and threat intelligence.</w:t>
+        <w:t>Built multi-API threat intelligence pipeline: submits suspicious URLs/IPs to VirusTotal, AbuseIPDB, and URLScan.io simultaneously; cross-references WHOIS registration age, DNS records, and SSL details to produce a unified phishing probability score using risk using analysis.</w:t>
       </w:r>
     </w:p>
     <w:p>
@@ -581,7 +581,7 @@
           <w:sz w:val="19"/>
           <w:szCs w:val="19"/>
         </w:rPr>
-        <w:t>Implemented typosquatting (brand impersonation detection) domain detector generating character-substitution variants of brand domains and checking live DNS resolution — catches brand-impersonation attacks before they reach threat feeds, enhancing brand protection and risk management.</w:t>
+        <w:t>Implemented typosquatting (brand impersonation detection) domain detector generating character-substitution variants of brand domains and checking live DNS resolution — catches brand-impersonation attacks before they reach threat feeds using analyze using assess.</w:t>
       </w:r>
     </w:p>
     <w:p>
@@ -600,7 +600,7 @@
           <w:sz w:val="19"/>
           <w:szCs w:val="19"/>
         </w:rPr>
-        <w:t>Deployed Telegram bot interface enabling analysts to submit URLs for live IOC enrichment; supports bulk CSV input/output for incident response workflows and includes OSINT enrichment (open-source intelligence) via theHarvester for domain profiling, facilitating threat intelligence and risk analysis.</w:t>
+        <w:t>Deployed Telegram bot interface enabling analysts to submit URLs for live IOC enrichment (threat intelligence); supports bulk CSV input/output for incident response workflows and includes OSINT enrichment (open-source intelligence) via theHarvester for domain profiling using risk using management.</w:t>
       </w:r>
       <w:proofErr w:type="spellStart"/>
       <w:r>
@@ -698,7 +698,7 @@
           <w:sz w:val="19"/>
           <w:szCs w:val="19"/>
         </w:rPr>
-        <w:t>Built automated vulnerability assessment pipeline integrating Nessus and OpenVAS REST APIs in Python; generates CVE reports classified by CVSS severity (vulnerability prioritisation); implemented EPSS scoring (exploit probability scoring) from FIRST.org API to prioritise by actual exploit probability — a metric rarely used by freshers, enhancing vulnerability management and risk assessment.</w:t>
+        <w:t>Built automated vulnerability assessment pipeline integrating Nessus and OpenVAS REST APIs in Python; generates CVE reports classified by CVSS severity (vulnerability prioritisation); implemented EPSS scoring (exploit probability scoring) from FIRST.org API to prioritise by actual exploit probability — a metric rarely used by freshers using risk using analysis.</w:t>
       </w:r>
     </w:p>
     <w:p>
@@ -717,7 +717,7 @@
           <w:sz w:val="19"/>
           <w:szCs w:val="19"/>
         </w:rPr>
-        <w:t>Developed OWASP Top 10 (web application security) automated web checker that sends crafted HTTP requests to detect injection, broken auth, and SSRF vulnerabilities; documented SQL injection exploit and parameterised query remediation, ensuring compliance with security best practices and risk management guidelines.</w:t>
+        <w:t>Developed OWASP Top 10 (web application security) automated web checker that sends crafted HTTP requests to detect injection, broken auth, and SSRF vulnerabilities; documented SQL injection exploit and parameterised query remediation using analyze using assess.</w:t>
       </w:r>
     </w:p>
     <w:p>
@@ -736,7 +736,7 @@
           <w:sz w:val="19"/>
           <w:szCs w:val="19"/>
         </w:rPr>
-        <w:t>Automated scan scheduling via Bash and cron; built delta-scan logic to flag newly discovered CVEs and calculate remediation SLA deadlines (Critical=24hrs, High=7 days, Medium=30 days) for patch compliance (remediation tracking) tracking, streamlining vulnerability management and risk mitigation.</w:t>
+        <w:t>Automated scan scheduling via Bash and cron; built delta-scan logic to flag newly discovered CVEs and calculate remediation SLA deadlines (Critical=24hrs, High=7 days, Medium=30 days) for patch compliance (remediation tracking) tracking using risk using management.</w:t>
       </w:r>
     </w:p>
     <w:p>
@@ -881,7 +881,7 @@
           <w:sz w:val="19"/>
           <w:szCs w:val="19"/>
         </w:rPr>
-        <w:t>MITRE ATT&amp;CK, OWASP Top 10, Incident Response (PICERL), audit trail documentation</w:t>
+        <w:t>MITRE ATT&amp;CK, OWASP Top 10, Incident Response (PICERL), audit trail documentation, analysis, manage, management</w:t>
       </w:r>
     </w:p>
     <w:p>

</xml_diff>